<commit_message>
All 3 print props: single page with embedded QR codes
</commit_message>
<xml_diff>
--- a/props/forged_transfer_document.docx
+++ b/props/forged_transfer_document.docx
@@ -4,7 +4,7 @@
   <w:body>
     <w:p>
       <w:pPr>
-        <w:spacing w:after="40" w:before="0"/>
+        <w:spacing w:after="20" w:before="0"/>
         <w:jc w:val="center"/>
       </w:pPr>
       <w:r>
@@ -22,7 +22,7 @@
     </w:p>
     <w:p>
       <w:pPr>
-        <w:spacing w:after="300" w:before="0"/>
+        <w:spacing w:after="200" w:before="0"/>
         <w:jc w:val="center"/>
       </w:pPr>
       <w:r>
@@ -40,7 +40,7 @@
     </w:p>
     <w:p>
       <w:pPr>
-        <w:spacing w:after="200" w:before="0"/>
+        <w:spacing w:after="140" w:before="0"/>
         <w:jc w:val="left"/>
       </w:pPr>
       <w:r>
@@ -82,7 +82,7 @@
     </w:p>
     <w:p>
       <w:pPr>
-        <w:spacing w:after="80" w:before="200"/>
+        <w:spacing w:after="40" w:before="120"/>
         <w:jc w:val="left"/>
       </w:pPr>
       <w:r>
@@ -100,7 +100,7 @@
     </w:p>
     <w:p>
       <w:pPr>
-        <w:spacing w:after="200" w:before="0"/>
+        <w:spacing w:after="140" w:before="0"/>
         <w:jc w:val="left"/>
       </w:pPr>
       <w:r>
@@ -118,7 +118,7 @@
     </w:p>
     <w:p>
       <w:pPr>
-        <w:spacing w:after="80" w:before="200"/>
+        <w:spacing w:after="40" w:before="120"/>
         <w:jc w:val="left"/>
       </w:pPr>
       <w:r>
@@ -136,7 +136,7 @@
     </w:p>
     <w:p>
       <w:pPr>
-        <w:spacing w:after="200" w:before="0"/>
+        <w:spacing w:after="140" w:before="0"/>
         <w:jc w:val="left"/>
       </w:pPr>
       <w:r>
@@ -154,7 +154,7 @@
     </w:p>
     <w:p>
       <w:pPr>
-        <w:spacing w:after="80" w:before="200"/>
+        <w:spacing w:after="40" w:before="120"/>
         <w:jc w:val="left"/>
       </w:pPr>
       <w:r>
@@ -172,7 +172,7 @@
     </w:p>
     <w:p>
       <w:pPr>
-        <w:spacing w:after="200" w:before="0"/>
+        <w:spacing w:after="100" w:before="0"/>
         <w:jc w:val="left"/>
       </w:pPr>
       <w:r>
@@ -190,7 +190,7 @@
     </w:p>
     <w:p>
       <w:pPr>
-        <w:spacing w:after="200" w:before="0"/>
+        <w:spacing w:after="100" w:before="0"/>
         <w:jc w:val="left"/>
       </w:pPr>
       <w:r>
@@ -208,7 +208,7 @@
     </w:p>
     <w:p>
       <w:pPr>
-        <w:spacing w:after="300" w:before="0"/>
+        <w:spacing w:after="160" w:before="0"/>
         <w:jc w:val="left"/>
       </w:pPr>
       <w:r>
@@ -226,7 +226,7 @@
     </w:p>
     <w:tbl>
       <w:tblPr>
-        <w:tblW w:type="dxa" w:w="9360"/>
+        <w:tblW w:type="dxa" w:w="9840"/>
         <w:tblBorders>
           <w:top w:val="single" w:color="auto" w:sz="4"/>
           <w:left w:val="single" w:color="auto" w:sz="4"/>
@@ -237,13 +237,13 @@
         </w:tblBorders>
       </w:tblPr>
       <w:tblGrid>
-        <w:gridCol w:w="4680"/>
-        <w:gridCol w:w="4680"/>
+        <w:gridCol w:w="4920"/>
+        <w:gridCol w:w="4920"/>
       </w:tblGrid>
       <w:tr>
         <w:tc>
           <w:tcPr>
-            <w:tcW w:type="dxa" w:w="4680"/>
+            <w:tcW w:type="dxa" w:w="4920"/>
             <w:tcBorders>
               <w:top w:val="none" w:sz="0"/>
               <w:left w:val="none" w:sz="0"/>
@@ -253,25 +253,7 @@
           </w:tcPr>
           <w:p>
             <w:pPr>
-              <w:spacing w:after="200" w:before="0"/>
-              <w:jc w:val="left"/>
-            </w:pPr>
-            <w:r>
-              <w:rPr>
-                <w:rFonts w:ascii="Times New Roman" w:cs="Times New Roman" w:eastAsia="Times New Roman" w:hAnsi="Times New Roman"/>
-                <w:b w:val="false"/>
-                <w:bCs w:val="false"/>
-                <w:i w:val="false"/>
-                <w:iCs w:val="false"/>
-                <w:sz w:val="22"/>
-                <w:szCs w:val="22"/>
-              </w:rPr>
-              <w:t xml:space="preserve"/>
-            </w:r>
-          </w:p>
-          <w:p>
-            <w:pPr>
-              <w:spacing w:after="80" w:before="0"/>
+              <w:spacing w:after="20" w:before="0"/>
               <w:jc w:val="left"/>
             </w:pPr>
             <w:r>
@@ -289,7 +271,7 @@
           </w:p>
           <w:p>
             <w:pPr>
-              <w:spacing w:after="20" w:before="0"/>
+              <w:spacing w:after="10" w:before="0"/>
               <w:jc w:val="left"/>
             </w:pPr>
             <w:r>
@@ -307,7 +289,7 @@
           </w:p>
           <w:p>
             <w:pPr>
-              <w:spacing w:after="20" w:before="0"/>
+              <w:spacing w:after="10" w:before="0"/>
               <w:jc w:val="left"/>
             </w:pPr>
             <w:r>
@@ -317,15 +299,15 @@
                 <w:bCs w:val="false"/>
                 <w:i/>
                 <w:iCs/>
-                <w:sz w:val="22"/>
-                <w:szCs w:val="22"/>
+                <w:sz w:val="20"/>
+                <w:szCs w:val="20"/>
               </w:rPr>
               <w:t xml:space="preserve">Transferor</w:t>
             </w:r>
           </w:p>
           <w:p>
             <w:pPr>
-              <w:spacing w:after="80" w:before="0"/>
+              <w:spacing w:after="60" w:before="0"/>
               <w:jc w:val="left"/>
             </w:pPr>
             <w:r>
@@ -335,8 +317,8 @@
                 <w:bCs w:val="false"/>
                 <w:i/>
                 <w:iCs/>
-                <w:sz w:val="22"/>
-                <w:szCs w:val="22"/>
+                <w:sz w:val="20"/>
+                <w:szCs w:val="20"/>
               </w:rPr>
               <w:t xml:space="preserve">Date: March 13, 1910</w:t>
             </w:r>
@@ -344,7 +326,7 @@
         </w:tc>
         <w:tc>
           <w:tcPr>
-            <w:tcW w:type="dxa" w:w="4680"/>
+            <w:tcW w:type="dxa" w:w="4920"/>
             <w:tcBorders>
               <w:top w:val="none" w:sz="0"/>
               <w:left w:val="none" w:sz="0"/>
@@ -354,25 +336,7 @@
           </w:tcPr>
           <w:p>
             <w:pPr>
-              <w:spacing w:after="200" w:before="0"/>
-              <w:jc w:val="left"/>
-            </w:pPr>
-            <w:r>
-              <w:rPr>
-                <w:rFonts w:ascii="Times New Roman" w:cs="Times New Roman" w:eastAsia="Times New Roman" w:hAnsi="Times New Roman"/>
-                <w:b w:val="false"/>
-                <w:bCs w:val="false"/>
-                <w:i w:val="false"/>
-                <w:iCs w:val="false"/>
-                <w:sz w:val="22"/>
-                <w:szCs w:val="22"/>
-              </w:rPr>
-              <w:t xml:space="preserve"/>
-            </w:r>
-          </w:p>
-          <w:p>
-            <w:pPr>
-              <w:spacing w:after="80" w:before="0"/>
+              <w:spacing w:after="20" w:before="0"/>
               <w:jc w:val="left"/>
             </w:pPr>
             <w:r>
@@ -390,7 +354,7 @@
           </w:p>
           <w:p>
             <w:pPr>
-              <w:spacing w:after="20" w:before="0"/>
+              <w:spacing w:after="10" w:before="0"/>
               <w:jc w:val="left"/>
             </w:pPr>
             <w:r>
@@ -408,7 +372,7 @@
           </w:p>
           <w:p>
             <w:pPr>
-              <w:spacing w:after="20" w:before="0"/>
+              <w:spacing w:after="10" w:before="0"/>
               <w:jc w:val="left"/>
             </w:pPr>
             <w:r>
@@ -418,15 +382,15 @@
                 <w:bCs w:val="false"/>
                 <w:i/>
                 <w:iCs/>
-                <w:sz w:val="22"/>
-                <w:szCs w:val="22"/>
+                <w:sz w:val="20"/>
+                <w:szCs w:val="20"/>
               </w:rPr>
               <w:t xml:space="preserve">Transferee</w:t>
             </w:r>
           </w:p>
           <w:p>
             <w:pPr>
-              <w:spacing w:after="80" w:before="0"/>
+              <w:spacing w:after="60" w:before="0"/>
               <w:jc w:val="left"/>
             </w:pPr>
             <w:r>
@@ -436,8 +400,8 @@
                 <w:bCs w:val="false"/>
                 <w:i/>
                 <w:iCs/>
-                <w:sz w:val="22"/>
-                <w:szCs w:val="22"/>
+                <w:sz w:val="20"/>
+                <w:szCs w:val="20"/>
               </w:rPr>
               <w:t xml:space="preserve">Date: March 13, 1910</w:t>
             </w:r>
@@ -447,25 +411,7 @@
     </w:tbl>
     <w:p>
       <w:pPr>
-        <w:spacing w:after="80" w:before="300"/>
-        <w:jc w:val="left"/>
-      </w:pPr>
-      <w:r>
-        <w:rPr>
-          <w:rFonts w:ascii="Times New Roman" w:cs="Times New Roman" w:eastAsia="Times New Roman" w:hAnsi="Times New Roman"/>
-          <w:b w:val="false"/>
-          <w:bCs w:val="false"/>
-          <w:i w:val="false"/>
-          <w:iCs w:val="false"/>
-          <w:sz w:val="22"/>
-          <w:szCs w:val="22"/>
-        </w:rPr>
-        <w:t xml:space="preserve"/>
-      </w:r>
-    </w:p>
-    <w:p>
-      <w:pPr>
-        <w:spacing w:after="80" w:before="200"/>
+        <w:spacing w:after="40" w:before="160"/>
         <w:jc w:val="left"/>
       </w:pPr>
       <w:r>
@@ -483,7 +429,7 @@
     </w:p>
     <w:p>
       <w:pPr>
-        <w:spacing w:after="200" w:before="0"/>
+        <w:spacing w:after="60" w:before="0"/>
         <w:jc w:val="left"/>
       </w:pPr>
       <w:r>
@@ -525,25 +471,7 @@
     </w:p>
     <w:p>
       <w:pPr>
-        <w:spacing w:after="80" w:before="200"/>
-        <w:jc w:val="left"/>
-      </w:pPr>
-      <w:r>
-        <w:rPr>
-          <w:rFonts w:ascii="Times New Roman" w:cs="Times New Roman" w:eastAsia="Times New Roman" w:hAnsi="Times New Roman"/>
-          <w:b w:val="false"/>
-          <w:bCs w:val="false"/>
-          <w:i w:val="false"/>
-          <w:iCs w:val="false"/>
-          <w:sz w:val="22"/>
-          <w:szCs w:val="22"/>
-        </w:rPr>
-        <w:t xml:space="preserve"/>
-      </w:r>
-    </w:p>
-    <w:p>
-      <w:pPr>
-        <w:spacing w:after="80" w:before="0"/>
+        <w:spacing w:after="60" w:before="100"/>
         <w:jc w:val="left"/>
       </w:pPr>
       <w:r>
@@ -561,25 +489,7 @@
     </w:p>
     <w:p>
       <w:pPr>
-        <w:spacing w:after="20" w:before="0"/>
-        <w:jc w:val="left"/>
-      </w:pPr>
-      <w:r>
-        <w:rPr>
-          <w:rFonts w:ascii="Times New Roman" w:cs="Times New Roman" w:eastAsia="Times New Roman" w:hAnsi="Times New Roman"/>
-          <w:b/>
-          <w:bCs/>
-          <w:i w:val="false"/>
-          <w:iCs w:val="false"/>
-          <w:sz w:val="22"/>
-          <w:szCs w:val="22"/>
-        </w:rPr>
-        <w:t xml:space="preserve">James Crawford</w:t>
-      </w:r>
-    </w:p>
-    <w:p>
-      <w:pPr>
-        <w:spacing w:after="80" w:before="0"/>
+        <w:spacing w:after="60" w:before="0"/>
         <w:jc w:val="left"/>
       </w:pPr>
       <w:r>
@@ -589,21 +499,21 @@
           <w:bCs w:val="false"/>
           <w:i/>
           <w:iCs/>
-          <w:sz w:val="22"/>
-          <w:szCs w:val="22"/>
-        </w:rPr>
-        <w:t xml:space="preserve">Notary Public, Dallas County, Texas</w:t>
-      </w:r>
-    </w:p>
-    <w:p>
-      <w:pPr>
-        <w:spacing w:before="400"/>
+          <w:sz w:val="20"/>
+          <w:szCs w:val="20"/>
+        </w:rPr>
+        <w:t xml:space="preserve">James Crawford, Notary Public, Dallas County, Texas</w:t>
+      </w:r>
+    </w:p>
+    <w:p>
+      <w:pPr>
+        <w:spacing w:before="200"/>
         <w:jc w:val="center"/>
       </w:pPr>
       <w:r>
         <w:drawing>
           <wp:inline distT="0" distB="0" distL="0" distR="0">
-            <wp:extent cx="952500" cy="952500"/>
+            <wp:extent cx="762000" cy="762000"/>
             <wp:effectExtent t="0" r="0" b="0" l="0"/>
             <wp:docPr id="1" name="" descr="" title=""/>
             <wp:cNvGraphicFramePr>
@@ -628,7 +538,7 @@
                   <pic:spPr bwMode="auto">
                     <a:xfrm>
                       <a:off x="0" y="0"/>
-                      <a:ext cx="952500" cy="952500"/>
+                      <a:ext cx="762000" cy="762000"/>
                     </a:xfrm>
                     <a:prstGeom prst="rect">
                       <a:avLst/>
@@ -643,7 +553,7 @@
     </w:p>
     <w:sectPr>
       <w:pgSz w:w="12240" w:h="15840" w:orient="portrait"/>
-      <w:pgMar w:top="1440" w:right="1440" w:bottom="1440" w:left="1440" w:header="708" w:footer="708" w:gutter="0"/>
+      <w:pgMar w:top="1200" w:right="1200" w:bottom="1000" w:left="1200" w:header="708" w:footer="708" w:gutter="0"/>
       <w:pgNumType/>
       <w:docGrid w:linePitch="360"/>
     </w:sectPr>

</xml_diff>